<commit_message>
Proofcheck Flour Play Brazilian Portuguese: MINOR (34 edits)
Co-Authored-By: Claude Opus 5.5 <noreply@anthropic.com>
Claude-Session: https://claude.ai/code/session_012Cm8JxdqzjuttdUSdkQCUg
</commit_message>
<xml_diff>
--- a/translated/corrected/Flour Play - ASSEMBLED - FORMATTED_Brazilian Portuguese.docx
+++ b/translated/corrected/Flour Play - ASSEMBLED - FORMATTED_Brazilian Portuguese.docx
@@ -214,7 +214,7 @@
     </w:p>
     <w:p>
       <w:r>
-        <w:t>Dot era robusta, grisalha e dizia muito com pouquíssimas palavras. Fazia coroas naquela loja havia décadas. Dava para ver em suas mãos. Elas nunca paravam e nunca erravam o passo.</w:t>
+        <w:t xml:space="preserve">Dot era robusta, grisalha e dizia muito com pouquíssimas palavras. Fazia guirlandas naquela loja havia décadas. Dava para ver em suas mãos. Elas nunca paravam e nunca erravam o passo.</w:t>
       </w:r>
     </w:p>
     <w:p/>
@@ -295,12 +295,12 @@
     </w:p>
     <w:p>
       <w:r>
-        <w:t xml:space="preserve">Ela colocou uma caixa de confeitaria do tamanho de uma chapeleira sobre a mesa, entre as pinhas e a fita, e pôs os punhos na cintura para nos inspecionar. Greta era dona da Holly Jolly Bakery ali na avenida, e tinha o formato de suas próprias rosquinhas, redonda e toda polvilhada de açúcar. Naquela manhã, havia farinha espalhada por todo o seu avental, a qual ela não se dera ao trabalho de escovar. </w:t>
-      </w:r>
-    </w:p>
-    <w:p>
-      <w:r>
-        <w:t>— Tirei uma fornada de cupcakes de chocolate com nozes do forno há nem uma hora e disse a mim mesma: Greta, quem está sentada numa loja fria tentando ser útil esta manhã? E a resposta foi todas vocês, então tomem.</w:t>
+        <w:t xml:space="preserve">Ela colocou uma caixa de padaria do tamanho de uma chapeleira sobre a mesa, entre as pinhas e a fita, e pôs os punhos na cintura para nos inspecionar. Greta era dona da padaria Holly Jolly ali na avenida, e tinha o formato de suas próprias rosquinhas, redonda e toda polvilhada de açúcar. Naquela manhã, havia farinha espalhada por todo o seu avental, a qual ela não se dera ao trabalho de escovar. </w:t>
+      </w:r>
+    </w:p>
+    <w:p>
+      <w:r>
+        <w:t xml:space="preserve">— Tirei uma fornada de cupcakes de chocolate com noz-pecã do forno há nem uma hora e disse a mim mesma: Greta, quem está sentada numa loja fria tentando ser útil esta manhã? E a resposta foi todas vocês, então tomem.</w:t>
       </w:r>
     </w:p>
     <w:p>
@@ -1106,7 +1106,7 @@
     </w:p>
     <w:p>
       <w:r>
-        <w:t>A grande vitrine da frente da Holly Jolly, aquela que exibia os dizeres HOLLY JOLLY BAKERY em letras douradas, estava estilhaçada. A maior parte havia caído para dentro, deixando um buraco pontiagudo na moldura, e as letras douradas jaziam em pedaços no peitoril e no chão. Um tijolo vermelho repousava sobre os azulejos lá dentro, no meio dos cacos, com uma crosta de argamassa velha e acinzentada ainda em uma de suas faces. O ar frio invadia a loja de Greta pelo buraco onde seu nome estivera.</w:t>
+        <w:t xml:space="preserve">A grande vitrine da frente da Holly Jolly, aquela que exibia os dizeres PADARIA HOLLY JOLLY em letras douradas, estava estilhaçada. A maior parte havia caído para dentro, deixando um buraco pontiagudo na moldura, e as letras douradas jaziam em pedaços no peitoril e no chão. Um tijolo vermelho repousava sobre os azulejos lá dentro, no meio dos cacos, com uma crosta de argamassa velha e acinzentada ainda em uma de suas faces. O ar frio invadia a loja de Greta pelo buraco onde seu nome estivera.</w:t>
       </w:r>
     </w:p>
     <w:p>
@@ -1417,7 +1417,7 @@
     </w:p>
     <w:p>
       <w:r>
-        <w:t>Ocupei a cadeira que tinham guardado para mim, bem no meio aconchegante do círculo, em vez da ponta fria perto da porta. Olivia colocou uma armação nova no meu colo e um punhado de abeto ao lado dele sem que eu precisasse pedir. Comecei a dispor os raminhos, um sobre o outro, todos apontando para casa, e fiquei ouvindo.</w:t>
+        <w:t xml:space="preserve">Ocupei a cadeira que tinham guardado para mim, bem no meio aconchegante do círculo, em vez da ponta fria perto da porta. Olivia colocou uma armação nova no meu colo e um punhado de abeto ao lado dela sem que eu precisasse pedir. Comecei a dispor os raminhos, um sobre o outro, todos apontando para casa, e fiquei ouvindo.</w:t>
       </w:r>
     </w:p>
     <w:p>
@@ -1808,7 +1808,7 @@
     <w:p/>
     <w:p>
       <w:r>
-        <w:t>Ele emergiu do lugar distante devagar, e virou-se, e um pequeno turbilhão de emoções cruzou seu rosto antes que ele se controlasse. Surpresa. Um sobressalto, meio oculto. Depois, um prazer cauteloso e contido. E, acima de tudo, o cansaço que ele carregava desde o Dia das Bruxas. Ele jamais o perderia por completo.</w:t>
+        <w:t xml:space="preserve">Ele emergiu do lugar distante devagar, e virou-se, e um pequeno turbilhão de emoções cruzou seu rosto antes que ele se controlasse. Surpresa. Um sobressalto, meio oculto. Depois, um prazer cauteloso e contido. E, acima de tudo, o cansaço que ele carregava desde o Halloween. Ele jamais o perderia por completo.</w:t>
       </w:r>
     </w:p>
     <w:p/>
@@ -2101,7 +2101,7 @@
     <w:p/>
     <w:p>
       <w:r>
-        <w:t>— Esse aí — disse Pete, dando leves batidinhas na carne de panela. — Forno brando, a tarde inteira. A senhora deixa a carne quieta, o que me disseram que é a parte difícil para a senhora. — Um brilho seco, que apareceu e sumiu. — Vou amarrar para você. Me dê um minuto.</w:t>
+        <w:t xml:space="preserve">— Esse aí — disse Pete, dando leves batidinhas na carne de panela. — Forno brando, a tarde inteira. A senhora deixa a carne quieta, o que me disseram que é a parte difícil para a senhora. — Um brilho seco, que apareceu e sumiu. — Vou amarrar para a senhora. Me dê um minuto.</w:t>
       </w:r>
     </w:p>
     <w:p/>
@@ -2331,7 +2331,7 @@
     <w:p/>
     <w:p>
       <w:r>
-        <w:t>— Você tem que vir ver a praça. Eles se mudaram. Todos os bonecos de neve da avenida se levantaram durante a noite e deram uma volta.</w:t>
+        <w:t xml:space="preserve">— Você tem que vir ver a praça. Eles saíram do lugar. Todos os bonecos de neve da avenida se levantaram durante a noite e deram uma volta.</w:t>
       </w:r>
     </w:p>
     <w:p/>
@@ -2403,7 +2403,7 @@
     <w:p/>
     <w:p>
       <w:r>
-        <w:t>O fato de não ter descongelado um grau sequer desde o Dia das Bruxas foi deixado passar.</w:t>
+        <w:t xml:space="preserve">O fato de não ter descongelado um grau sequer desde o Halloween foi deixado passar.</w:t>
       </w:r>
     </w:p>
     <w:p/>
@@ -3019,7 +3019,7 @@
     </w:p>
     <w:p>
       <w:r>
-        <w:t>— Dinheiro, conhecimento e um jeito de entrar. — falei vagarosamente. Eu havia juntado as três coisas na cabeça durante a caminhada de descida e ainda não gostava do lugar para onde apontavam; só sabia que não apontavam mais morro acima, para os pobres. — É preciso ter as três, se estou certa sobre a farinha. Dinheiro para comprar o que quer que a tenha estragado. Conhecimento, para saber que tal coisa existe, o que ela faz e quanto usar. E um jeito de alcançar uma lata de farinha atrás de uma porta trancada no escuro. Tire qualquer uma das três e você não consegue fazer isso. E os Doucette não têm nenhuma das três, que dirá todas.</w:t>
+        <w:t xml:space="preserve">— Dinheiro, conhecimento e um jeito de entrar — falei vagarosamente. Eu havia juntado as três coisas na cabeça durante a caminhada de descida e ainda não gostava do lugar para onde apontavam; só sabia que não apontavam mais morro acima, para os pobres. — É preciso ter as três, se estou certa sobre a farinha. Dinheiro para comprar o que quer que a tenha estragado. Conhecimento, para saber que tal coisa existe, o que ela faz e quanto usar. E um jeito de alcançar uma lata de farinha atrás de uma porta trancada no escuro. Tire qualquer uma das três e você não consegue fazer isso. E os Doucette não têm nenhuma das três, que dirá todas.</w:t>
       </w:r>
     </w:p>
     <w:p>
@@ -3175,7 +3175,7 @@
     </w:p>
     <w:p>
       <w:r>
-        <w:t>Eu desci em direção à praça na luz azul decrescente, pretendendo ir direto para casa, e o boneco de neve perto da farmácia havia se movido de novo. A grande reunião no gramado ainda se inclinava para dentro em direção ao fogo invisível e quente deles, tão pacientes como sempre. Mas aquele que ficara isolado na entrada da viela naqueles dois dias havia se deslocado no escuro do último dia, e em vez de se inclinar em direção à praça com o resto, ele se inclinava fortemente para o outro lado, com seu rosto de carvão e todo o seu peso informe voltado para os fundos das lojas da Evergreen.</w:t>
+        <w:t xml:space="preserve">Eu desci em direção à praça na luz azul decrescente, pretendendo ir direto para casa, e o boneco de neve perto da farmácia havia se movido de novo. A grande reunião no gramado ainda se inclinava para dentro em direção ao fogo invisível e quente deles, tão pacientes como sempre. Mas aquele que ficara isolado na entrada do beco naqueles dois dias havia se deslocado no escuro do último dia, e em vez de se inclinar em direção à praça com o resto, ele se inclinava fortemente para o outro lado, com seu rosto de carvão e todo o seu peso informe voltado para os fundos das lojas da Evergreen.</w:t>
       </w:r>
     </w:p>
     <w:p>
@@ -3185,7 +3185,7 @@
     </w:p>
     <w:p>
       <w:r>
-        <w:t>Eu fiquei parada e olhei para onde ela olhava, para os fundos escuros das lojas, os degraus cobertos de neve e as portas fechadas. A magia não conseguia me dizer um nome. Nunca conseguia. Ela tinha mais coração do que inteligência, meu Nick dizia, e não sabia soletrar. Ela ficara dois dias virada para aquela viela, e agora se inclinava para os fundos das lojas, e eu não conseguia imaginar o porquê.</w:t>
+        <w:t xml:space="preserve">Eu fiquei parada e olhei para onde ele olhava, para os fundos escuros das lojas, os degraus cobertos de neve e as portas fechadas. A magia não conseguia me dizer um nome. Nunca conseguia. Ela tinha mais coração do que inteligência, meu Nick dizia, e não sabia soletrar. Ela ficara dois dias virada para aquele beco, e agora se inclinava para os fundos das lojas, e eu não conseguia imaginar o porquê.</w:t>
       </w:r>
     </w:p>
     <w:p>
@@ -3205,7 +3205,7 @@
     </w:p>
     <w:p>
       <w:r>
-        <w:t>Deixei o boneco de neve em sua vigília longa e paciente sobre a viela e fui para casa com o pote pesado no casaco, a única coisa sólida que eu tinha e que apontava para algum lugar.</w:t>
+        <w:t xml:space="preserve">Deixei o boneco de neve em sua vigília longa e paciente sobre o beco e fui para casa com o pote pesado no casaco, a única coisa sólida que eu tinha e que apontava para algum lugar.</w:t>
       </w:r>
     </w:p>
     <w:p>
@@ -3553,7 +3553,7 @@
     </w:p>
     <w:p>
       <w:r>
-        <w:t>— Um adulto. Nada de moleque, não importa o que a cidade queira empurrar para cima de algum garotinho com uma lata de tinta. Mais alto que a Greta, e se movendo com um propósito. Sem enrolação. Sem esquentar as mãos. Ele sabia por que estava ali. E coberto. Um casaco comprido, ou um avental, solto, daqueles que a gente veste para trabalhar para não se sujar, pálido, eu diria quase, embora a escuridão tenha roubado a cor dele. Bem colado na parede dela, onde fica a entrega e nenhum recado honesto vai. E quando os faróis do meu carro viraram, ele sumiu, rápido e silencioso, não foi uma fuga atropelada, foi uma retirada. Sem pressa nenhuma. Feito e acabado.</w:t>
+        <w:t xml:space="preserve">— Um adulto. Nada de moleque, não importa o que a cidade queira empurrar para cima de algum garotinho com uma lata de tinta. Mais alto que a Greta, e se movendo com um propósito. Sem enrolação. Sem esquentar as mãos. Ele sabia por que estava ali. E coberto. Um casaco comprido, ou um avental, solto, daqueles que a gente veste para trabalhar para não se sujar, pálido, eu diria quase, embora a escuridão tenha roubado a cor dele. Bem colado na parede dela, onde fica a entrega e aonde ninguém vai com intenção honesta. E quando os faróis do meu carro viraram, ele sumiu, rápido e silencioso, não foi uma fuga atropelada, foi uma retirada. Sem pressa nenhuma. Feito e acabado.</w:t>
       </w:r>
     </w:p>
     <w:p>
@@ -3710,7 +3710,7 @@
     <w:p/>
     <w:p>
       <w:r>
-        <w:t>Encontrei Danny Ott na praça com a luz moribunda, onde todo mundo dizia que ele estaria. Por uma vez eles estavam certos, embora tirassem a lição errada disso. Ele estava no lado do monumento aos mortos em guerra com outros dois da turma, nenhum deles fazendo nada pior do que estar com frio e ter quinze anos sem nada para preencher a escuridão. Quando me aproximei, os outros se afastaram, querendo distância de uma mulher adulta com um propósito. Danny não. Ele manteve firme sua posição junto ao corrimão, um garoto alto e magro em um casaco um número menor, curto nos pulsos, com o ar de quem ouve o que estão dizendo e sabe que não pode fugir disso.</w:t>
+        <w:t xml:space="preserve">Encontrei Danny Ott na praça com a luz moribunda, onde todo mundo dizia que ele estaria. Por uma vez eles estavam certos, embora tirassem a lição errada disso. Ele estava no lado do memorial de guerra com outros dois da turma, nenhum deles fazendo nada pior do que estar com frio e ter quinze anos sem nada para preencher a escuridão. Quando me aproximei, os outros se afastaram, querendo distância de uma mulher adulta com um propósito. Danny não. Ele manteve firme sua posição junto ao corrimão, um garoto alto e magro em um casaco um número menor, curto nos pulsos, com o ar de quem ouve o que estão dizendo e sabe que não pode fugir disso.</w:t>
       </w:r>
     </w:p>
     <w:p/>
@@ -3776,7 +3776,7 @@
     <w:p/>
     <w:p>
       <w:r>
-        <w:t>— Não foi você — eu disse. — E quem quer que tenha pintado aquilo não azedou a farinha dela. Estive correndo atrás da parte barulhenta. — Eu me levantei, e Pip levantou-se comigo. — Você passa as noites acordado, no entanto. Viu alguém nos fundos das lojas antes da luz do dia que não tivesse nenhum recado honesto por lá?</w:t>
+        <w:t xml:space="preserve">— Não foi você — eu disse. — E quem quer que tenha pintado aquilo não azedou a farinha dela. Estive correndo atrás da parte barulhenta. — Eu me levantei, e Pip levantou-se comigo. — Você passa as noites acordado, no entanto. Viu alguém nos fundos das lojas antes da luz do dia que não tivesse nada de honesto para fazer por lá?</w:t>
       </w:r>
     </w:p>
     <w:p/>
@@ -3788,7 +3788,7 @@
     <w:p/>
     <w:p>
       <w:r>
-        <w:t>— Guarde isso, então — eu disse —, e traga para mim quando ficar claro. Não fique matutando.</w:t>
+        <w:t xml:space="preserve">— Guarde isso, então — eu disse —, e traga para mim quando ficar claro. Não enfeite nada.</w:t>
       </w:r>
     </w:p>
     <w:p/>
@@ -3830,7 +3830,7 @@
     <w:p/>
     <w:p>
       <w:r>
-        <w:t>O círculo se reuniu naquela noite sem guirlandas. Olivia havia telefonado por toda a tarde: apenas tricô, porque o barril de roupas quentes de Hal havia sido esvaziado duas vezes em uma semana e as famílias no alto do morro precisavam de gorros. Então as armações permaneceram empilhados na sala dos fundos, e nós sete puxamos nossas cadeiras ao redor do fogão com agulhas e cada ponta de fio de lã na loja.</w:t>
+        <w:t xml:space="preserve">O círculo se reuniu naquela noite sem guirlandas. Olivia havia telefonado por toda a tarde: apenas tricô, porque o barril de roupas quentes de Hal havia sido esvaziado duas vezes em uma semana e as famílias no alto do morro precisavam de gorros. Então as armações permaneceram empilhadas na sala dos fundos, e nós sete puxamos nossas cadeiras ao redor do fogão com agulhas e cada ponta de fio de lã na loja.</w:t>
       </w:r>
     </w:p>
     <w:p/>
@@ -4533,7 +4533,7 @@
     <w:p/>
     <w:p>
       <w:r>
-        <w:t>— Elas pararam — disse ele, antes que eu pudesse perguntar. — As olhadas. O que a senhora disse à sra. Bennett se espalhou. Uma senhora lá da escola disse à minha mãe com todas as letras que não podia ter sido eu. — Ele olhou para as balas de mel em vez de para mim. — Então… obrigado. Eu sei que foi você.</w:t>
+        <w:t xml:space="preserve">— Elas pararam — disse ele, antes que eu pudesse perguntar. — As olhadas. O que a senhora disse à sra. Bennett se espalhou. Uma senhora lá da escola disse à minha mãe com todas as letras que não podia ter sido eu. — Ele olhou para as balas de mel em vez de para mim. — Então… obrigado. Eu sei que foi a senhora.</w:t>
       </w:r>
     </w:p>
     <w:p/>
@@ -4551,7 +4551,7 @@
     <w:p/>
     <w:p>
       <w:r>
-        <w:t>— A tinta primeiro, então — eu disse. — Quero deixar isso limpo e resolvido, para que, se alguém voltar a citar o seu nome, não haja onde se agarrar. Você sabe quem fez aquilo, sabe, não sabe? Você vigia aquela praça depois que anoitece.</w:t>
+        <w:t xml:space="preserve">— A tinta primeiro, então — eu disse. — Quero deixar isso limpo e resolvido, para que, se alguém voltar a citar o seu nome, não haja onde se agarrar. Você sabe quem fez aquilo, não sabe? Você vigia aquela praça depois que anoitece.</w:t>
       </w:r>
     </w:p>
     <w:p/>
@@ -4605,13 +4605,13 @@
     <w:p/>
     <w:p>
       <w:r>
-        <w:t>— Houve uma caixa. Noutro dia de manhã. Estava parada do lado de fora da porta dos fundos da Greta, e não era um dos sacos de farinha dela. Era uma embalagem impressa, e eu me lembro porque tinha dourado. Letras douradas na lateral. Não consegui ler da nossa janela. — Ele olhou para mim então. — Quando olhei de novo, tinha sumido. A senhora disse para eu lhe trazer quando lembrasse direito.</w:t>
-      </w:r>
-    </w:p>
-    <w:p/>
-    <w:p>
-      <w:r>
-        <w:t>Apenas uma loja na Evergreen embalava seus produtos em dourado. Letras douradas nas caixas, fita dourada nos financiers. E ela ficava no extremo oposto do quarteirão, depois da farmácia, por onde uma figura esguia e rápida de avental claro subira no escuro. O Pete vira aquela figura de seu caminhão e o Danny a vira da cozinha, e nenhum deles ouvira o outro contar.</w:t>
+        <w:t xml:space="preserve">— Houve uma caixa. Em outra manhã. Estava parada do lado de fora da porta dos fundos da Greta, e não era um dos sacos de farinha dela. Era uma embalagem impressa, e eu me lembro porque tinha dourado. Letras douradas na lateral. Não consegui ler da nossa janela. — Ele olhou para mim então. — Quando olhei de novo, tinha sumido. A senhora disse para eu lhe trazer quando lembrasse direito.</w:t>
+      </w:r>
+    </w:p>
+    <w:p/>
+    <w:p>
+      <w:r>
+        <w:t xml:space="preserve">Apenas uma loja na Evergreen embalava seus produtos em dourado. Letras douradas nas caixas, fita dourada nos financiers. E ela ficava no extremo oposto do quarteirão, depois da farmácia, onde uma figura esguia e rápida de avental claro subira o beco no escuro. O Pete vira aquela figura de seu caminhão e o Danny a vira da cozinha, e nenhum deles ouvira o outro contar.</w:t>
       </w:r>
     </w:p>
     <w:p/>
@@ -4983,7 +4983,7 @@
     <w:p/>
     <w:p>
       <w:r>
-        <w:t>Perto do monumento aos mortos de guerra, Pip disparou na frente rumo à encosta batida de neve onde as crianças andavam de trenó, deitou-se de barriga e desceu deslizando num único movimento longo e fluido, com as nadadeiras para trás. Lá embaixo, levantou-se, sacudiu-se e olhou para trás para ver se eu tinha assistido. Eu assistira. Desci atrás dela do jeito mais lento, a pé.</w:t>
+        <w:t xml:space="preserve">Perto do memorial de guerra, Pip disparou na frente rumo à encosta batida de neve onde as crianças andavam de trenó, deitou-se de barriga e desceu deslizando num único movimento longo e fluido, com as nadadeiras para trás. Lá embaixo, levantou-se, sacudiu-se e olhou para trás para ver se eu tinha assistido. Eu assistira. Desci atrás dela do jeito mais lento, a pé.</w:t>
       </w:r>
     </w:p>
     <w:p/>
@@ -5723,7 +5723,7 @@
     </w:p>
     <w:p>
       <w:r>
-        <w:t>— A carta em agosto — eu disse. — A empresa que quis comprar sua parte. Lembra-se do nome?</w:t>
+        <w:t xml:space="preserve">— A carta em agosto — eu disse. — A empresa que quis comprar a sua padaria. Lembra-se do nome?</w:t>
       </w:r>
     </w:p>
     <w:p>
@@ -5935,7 +5935,7 @@
     </w:p>
     <w:p>
       <w:r>
-        <w:t>— O doutor achou uma base azeda na farinha da Greta — eu disse. — Do tipo que uma padaria compra para fazer centeio. Uma padaria em Bridgton tem ligado para os clientes da Greta chamando-os pelo nome, oferecendo-se para assumir as encomendas deles na Holly Jolly. E a empresa que escreveu em agosto para comprar Greta está registrada no nome da mulher que é dona dessa padaria. — Respirei fundo antes de fazer a única pergunta pela qual eu havia ligado. — Você pode averiguar se a Pelkey's, em Lewiston, entregou uma base azeda à Wendt's Bakehouse neste outono?</w:t>
+        <w:t xml:space="preserve">— O doutor achou uma base azeda na farinha da Greta — eu disse. — Do tipo que uma padaria compra para fazer centeio. Uma padaria em Bridgton tem ligado para os clientes da Greta chamando-os pelo nome, oferecendo-se para assumir as encomendas deles na Holly Jolly. E a empresa que escreveu em agosto para comprar a padaria da Greta está registrada no nome da mulher que é dona dessa padaria. — Respirei fundo antes de fazer a única pergunta pela qual eu havia ligado. — Você pode averiguar se a Pelkey's, em Lewiston, entregou uma base azeda à Wendt's Bakehouse neste outono?</w:t>
       </w:r>
     </w:p>
     <w:p>
@@ -5975,7 +5975,7 @@
     </w:p>
     <w:p>
       <w:r>
-        <w:t>— Bob Pelkey estava jantando com os netos — disse Tanaka. — Ele consultou o notebook na mesa da cozinha. A Wendt's Bakehouse tem conta com eles há vinte e cinco anos. Um saco da base azeda deles a cada poucas semanas, para o centeio que ela assava para as pousadas, até o mês de junho. Depois, nada. Ele diz que ela perdeu o contrato grande com a pousada durante o verão, e o centeio foi junto. — Uma página virou do outro lado da linha. — Então, um saco em 27 de outubro, entregue na padaria. Ele diz que o recibo do motorista está assinado por J. Wendt. Ele vai direto para o escritório amanhã cedo e me enviará as faturas e os recibos assinados.</w:t>
+        <w:t xml:space="preserve">— Bob Pelkey estava jantando com os netos — disse Tanaka. — Ele consultou o notebook na mesa da cozinha. A Wendt's Bakehouse tem conta com eles há vinte e cinco anos. Um saco da base azeda deles a cada poucas semanas, para o centeio que ela assava para as pousadas, até o mês de junho. Depois, nada. Ele diz que ela perdeu o contrato grande com a pousada durante o verão, e o centeio foi junto. — Uma página virou do outro lado da linha. — Então, um saco em vinte e sete de outubro, entregue na padaria. Ele diz que o recibo do motorista está assinado por J. Wendt. Ele vai direto para o escritório amanhã cedo e me enviará as faturas e os recibos assinados.</w:t>
       </w:r>
     </w:p>
     <w:p>
@@ -6129,7 +6129,7 @@
     </w:p>
     <w:p>
       <w:r>
-        <w:t>— A denúncia chamou a câmara frigorífica de "o cômodo frio" e a pia de lavar as mãos de "pia Hobart". Greta diz que ninguém as chama assim desde a época de Joyce. O cadeado do portão do pátio nunca foi trocado, e Pete diz que ele vive escapando. E a azedagem parou na manhã em que Greta começou a trancar a porta dos fundos com ferrolho após o tijolo, então quem quer que tenha feito aquilo estava entrando por ali. Ele viu uma van perto da farmácia antes do amanhecer, com os faróis apagados, e não era a do entregador de carne. Ontem ele olhou para a impressão que Claire tirou da van dos Wendt e disse: "É essa."</w:t>
+        <w:t xml:space="preserve">— A denúncia chamou a câmara frigorífica de "o cômodo frio" e a pia de lavar as mãos de "pia Hobart". Greta diz que ninguém as chama assim desde a época de Joyce. O cadeado do portão do pátio nunca foi trocado, e Pete diz que ele vive escapando. E a azedagem parou na manhã em que Greta começou a trancar a porta dos fundos com ferrolho após o tijolo, então quem quer que tenha feito aquilo estava entrando por ali. Pete viu uma van perto da farmácia antes do amanhecer, com os faróis apagados, e não era a do entregador de carne. Ontem ele olhou para a impressão que Claire tirou da van dos Wendt e disse: "É essa."</w:t>
       </w:r>
     </w:p>
     <w:p>
@@ -6430,7 +6430,7 @@
     <w:p/>
     <w:p>
       <w:r>
-        <w:t>Eu gostara dela. Eu gostara dela na loja de Greta na manhã da vitrine, com a vassoura de piaçava nas mãos, e gostara dela no salão da Grange com os braços cheios de pão para os barris de Hal, e forcei-me a manter tudo aquilo bem nítido na minha mente enquanto Tanaka falava.</w:t>
+        <w:t xml:space="preserve">Eu gostara dela. Eu gostara dela na loja de Greta na manhã da vitrine, com a vassoura de cabo nas mãos, e gostara dela no salão da Grange com os braços cheios de pão para os barris de Hal, e forcei-me a manter tudo aquilo bem nítido na minha mente enquanto Tanaka falava.</w:t>
       </w:r>
     </w:p>
     <w:p/>
@@ -6526,7 +6526,7 @@
     <w:p/>
     <w:p>
       <w:r>
-        <w:t>— Vinte e cinco anos — disse ela a Greta. — Você nunca trocou. Meu Deus, Gret.</w:t>
+        <w:t xml:space="preserve">— Vinte e cinco anos — disse ela a Greta. — Você nunca trocou o cadeado. Meu Deus, Gret.</w:t>
       </w:r>
     </w:p>
     <w:p/>
@@ -6807,7 +6807,7 @@
     <w:p/>
     <w:p>
       <w:r>
-        <w:t>— Falsa comunicação a uma autoridade sanitária. A denúncia. O "cômodo frio" e a "pia Hobart", digitados e enviadas ao condado para que Alan Varney fechasse uma cozinha limpa. — Ela pôs um dedo sobre a página. — Essa é a mais grave. Ela pegou um inspetor cujo trabalho é manter as pessoas seguras e o apontou contra uma mulher que não havia feito nada de errado.</w:t>
+        <w:t xml:space="preserve">— Falsa comunicação a uma autoridade sanitária. A denúncia. O "cômodo frio" e a "pia Hobart", digitados e enviados ao condado para que Alan Varney fechasse uma cozinha limpa. — Ela pôs um dedo sobre a página. — Essa é a mais grave. Ela pegou um inspetor cujo trabalho é manter as pessoas seguras e o apontou contra uma mulher que não havia feito nada de errado.</w:t>
       </w:r>
     </w:p>
     <w:p/>
@@ -6885,7 +6885,7 @@
     <w:p/>
     <w:p>
       <w:r>
-        <w:t>Subi a Evergreen passando pela Holly Jolly. Ainda estava fechada, o aviso amarelo do condado ainda na janela até que Varney viesse tirá-lo, mas havia luz nos fundos e cheiro de doces assando na porta, embora ela ainda não tivesse ninguém a quem vender. Não bati. O cálculo era da chefe para lhe trazer.</w:t>
+        <w:t xml:space="preserve">Subi a Evergreen passando pela Holly Jolly. Ainda estava fechada, o aviso amarelo do condado ainda na janela até que Varney viesse tirá-lo, mas havia luz nos fundos e cheiro de doces assando na porta, embora ela ainda não tivesse ninguém a quem vender. Não bati. Cabia à chefe levar aquele cálculo a ela.</w:t>
       </w:r>
     </w:p>
     <w:p/>
@@ -7349,7 +7349,7 @@
     </w:p>
     <w:p>
       <w:r>
-        <w:t>Ele carregou telhas escada acima no gelo, entregou-as aos homens na cumeeira e desceu para buscar mais. Ele nunca disse como aquilo devia ser feito, embora conhecesse o prédio melhor do que qualquer um no telhado e todos ali soubessem disso. Ele não foi reintegrado. Não seria, não naquele inverno, e ele aceitara isso de forma tão silenciosa quanto aceitara o trabalho com o mata-borrão, de joelhos, em um quartinho frio nos fundos. Ninguém havia esquecido o mês passado, muito menos ele. Mas deixaram-no carregar telhas, e ele as carregou. Quando achou que ninguém estava olhando, o rosto dele estava mais tranquilo do que eu via desde o Dia das Bruxas.</w:t>
+        <w:t xml:space="preserve">Ele carregou telhas escada acima no gelo, entregou-as aos homens na cumeeira e desceu para buscar mais. Ele nunca disse como aquilo devia ser feito, embora conhecesse o prédio melhor do que qualquer um no telhado e todos ali soubessem disso. Ele não foi reintegrado. Não seria, não naquele inverno, e ele aceitara isso de forma tão silenciosa quanto aceitara o trabalho com o mata-borrão, de joelhos, em um quartinho frio nos fundos. Ninguém havia esquecido o mês passado, muito menos ele. Mas deixaram-no carregar telhas, e ele as carregou. Quando achou que ninguém estava olhando, o rosto dele estava mais tranquilo do que eu via desde o Halloween.</w:t>
       </w:r>
     </w:p>
     <w:p>

</xml_diff>

<commit_message>
Full proofcheck Flour Play Brazilian Portuguese: SIGNIFICANT (48 edits); all 28 full reads done
Co-Authored-By: Claude Opus 5.5 <noreply@anthropic.com>
Claude-Session: https://claude.ai/code/session_012Cm8JxdqzjuttdUSdkQCUg
</commit_message>
<xml_diff>
--- a/translated/corrected/Flour Play - ASSEMBLED - FORMATTED_Brazilian Portuguese.docx
+++ b/translated/corrected/Flour Play - ASSEMBLED - FORMATTED_Brazilian Portuguese.docx
@@ -639,7 +639,7 @@
     </w:p>
     <w:p>
       <w:r>
-        <w:t>Ela puxou a cabeça para trás, como se tivesse levado um bico, e deu um chacoalhão curto e ofendido. Deu dois passos para trás sobre os ladrilhos e ficou com as penas eriçadas bem alto no pescoço, olhando para a farinha com nítida reprovação. Era a cara que fazia para um arenque estragado. Não chegaria perto daquilo de novo. Desviou dando uma volta larga e veio parar atrás dos meus calcanhares.</w:t>
+        <w:t>Ela puxou a cabeça para trás, como se tivesse levado um beliscão, e deu um chacoalhão curto e ofendido. Deu dois passos para trás sobre os ladrilhos e ficou com as penas eriçadas bem alto no pescoço, olhando para a farinha com nítida reprovação. Era a cara que fazia para um arenque estragado. Não chegaria perto daquilo de novo. Desviou dando uma volta larga e veio parar atrás dos meus calcanhares.</w:t>
       </w:r>
     </w:p>
     <w:p>
@@ -817,7 +817,7 @@
     <w:p/>
     <w:p>
       <w:r>
-        <w:t>— Apenas o que se ouve. — Renée estendeu as mãos frias, pura solidariedade. — A porta dela tem ficado fechada a manhã toda, e o pessoal do pão diz que ela teve uma fase ruim. Fornadas dando errado, esse tipo de desagrado. Sinto muito por ela. — Ela balançou a cabeça. — Embora eu lhe diga, neste ramo, uma vez que o nome de uma cozinha é posto em dúvida… — ela olhou para mim, franca e arrependida, como uma profissional confidenciando a uma amiga — as pessoas acabam comentando, não é? Não é justo, mas é assim mesmo. Uma padaria vive de seu nome. Deixe uma dúvida entrar e é um diabo para tirá-la de lá de novo. — Ela sorriu. — Mas olhe para mim, falando de negócios quando a senhora só veio dizer olá. Entre. Quero que veja os fornos.</w:t>
+        <w:t>— Apenas o que se ouve. — Renée estendeu as mãos frias, pura solidariedade. — A porta dela tem ficado fechada a manhã toda, e o pessoal do pão diz que ela teve uma fase ruim. Fornadas dando errado, esse tipo de desagrado. Sinto muito por ela. — Ela balançou a cabeça. — Embora eu lhe diga, neste ramo, uma vez que o nome de uma cozinha é posto em dúvida… — ela olhou para mim, franca e pesarosa, como uma profissional confidenciando a uma amiga — as pessoas acabam comentando, não é? Não é justo, mas é assim mesmo. Uma padaria vive de seu nome. Deixe uma dúvida entrar e é um diabo para tirá-la de lá de novo. — Ela sorriu. — Mas olhe para mim, falando de negócios quando a senhora só veio dizer olá. Entre. Quero que veja os fornos.</w:t>
       </w:r>
     </w:p>
     <w:p/>
@@ -949,7 +949,7 @@
     <w:p/>
     <w:p>
       <w:r>
-        <w:t>Hal endireitou o corpo, descolando-se do balcão, e virou a folha de papel para que eu pudesse ler, com o prazer tímido de um homem cauteloso exibindo algo em que pensara muito. Hal administrava o Frosty's, na ponta mais próxima da avenida, e era a alma mais organizada de Frost Falls. Suas latas ficavam viradas para a frente e suas maçãs repousavam com o cabinho para cima nas caixas.</w:t>
+        <w:t>Hal endireitou o corpo, descolando-se do balcão, e virou a folha de papel para que eu pudesse ler, com o prazer tímido de um homem cauteloso exibindo algo em que pensara muito. Hal administrava o Frosty's, a mercearia na ponta mais próxima da avenida, e era a alma mais organizada de Frost Falls. Suas latas ficavam viradas para a frente e suas maçãs repousavam com o cabinho para cima nas caixas.</w:t>
       </w:r>
     </w:p>
     <w:p/>
@@ -997,7 +997,7 @@
     <w:p/>
     <w:p>
       <w:r>
-        <w:t>Caminhei para casa na penumbra da noite, enquanto as luzes das lojas se acendiam em tom dourado ao longo da avenida, e fui revirando o dia na cabeça enquanto andava. Hal, preparando-se para o frio antes que a necessidade batesse. Greta, lá no outro extremo da avenida, com a loja escura e o falatório já à solta na rua, ajudada bem de leve por uma mulher que me dera manteiga noisette.</w:t>
+        <w:t>Caminhei para casa na penumbra da noite, enquanto as luzes das lojas se acendiam em tom dourado ao longo da avenida, e fui revirando o dia na cabeça enquanto andava. Hal, preparando-se para o frio antes que a necessidade batesse. Greta, lá no outro extremo da avenida, com a loja escura e o falatório já à solta na rua, ajudado bem de leve por uma mulher que me dera manteiga noisette.</w:t>
       </w:r>
     </w:p>
     <w:p/>
@@ -1126,7 +1126,7 @@
     </w:p>
     <w:p>
       <w:r>
-        <w:t>Uma janela quebrada era um prejuízo que podia ser consertado. Greta teria vidro novo até o final da semana. Mas quem quer que tivesse entrado na escuridão da noite não havia parado no vidro: tinham escrito, num lugar onde todos na avenida leriam ao passar, que a comida dela era imunda e sua loja, um perigo. E uma padaria, como Renée me dissera dois dias antes na calçada do lado de fora de sua nova loja, vive de sua reputação.</w:t>
+        <w:t>Uma janela quebrada era um prejuízo que podia ser consertado. Greta teria vidro novo até o final da semana. Mas quem quer que tivesse vindo durante a noite não havia parado no vidro: tinham escrito, num lugar onde todos na avenida leriam ao passar, que a comida dela era imunda e sua loja, um perigo. E uma padaria, como Renée me dissera dois dias antes na calçada do lado de fora de sua nova loja, vive de seu nome.</w:t>
       </w:r>
     </w:p>
     <w:p>
@@ -1251,7 +1251,7 @@
     </w:p>
     <w:p>
       <w:r>
-        <w:t>Uma caminhonete entrou encostando no meio-fio, logo atrás da picape de Hal. Era uma van branca de padaria, com a inscrição WENDT'S BAKEHOUSE · BRIDGTON grafada em marrom na lateral. A mulher que saltou dela aparentava ter a idade de Greta, era magra e rápida, vestindo uma parka aberta sobre a dólmã branca de padeira. Ela olhou para o compensado, depois para Tom esfregando as letras vermelhas, e sua boca se contraiu. Então entrou pela porta escancarada.</w:t>
+        <w:t>Uma van encostou no meio-fio, logo atrás da caminhonete de Hal. Era uma van branca de padaria, com a inscrição WENDT'S BAKEHOUSE · BRIDGTON grafada em marrom na lateral. A mulher que saltou dela aparentava ter a idade de Greta, era magra e rápida, vestindo uma parka aberta sobre a dólmã branca de padeira. Ela olhou para o compensado, depois para Tom esfregando as letras vermelhas, e sua boca se contraiu. Então entrou pela porta escancarada.</w:t>
       </w:r>
     </w:p>
     <w:p>
@@ -1271,7 +1271,7 @@
     </w:p>
     <w:p>
       <w:r>
-        <w:t>Foi só o que as duas disseram. Por cima do ombro de Greta, Olivia ergueu os olhos do radiador para Ellie, e Ellie olhou de volta.</w:t>
+        <w:t>Foi só o que as duas disseram. Pelas costas de Greta, Olivia ergueu os olhos do radiador para Ellie, e Ellie olhou de volta.</w:t>
       </w:r>
     </w:p>
     <w:p>
@@ -1607,7 +1607,7 @@
     </w:p>
     <w:p>
       <w:r>
-        <w:t>— Ninguém legal — disse Ellie, chateada.</w:t>
+        <w:t>— Ninguém legal — disse Ellie, chateada. E continuou:</w:t>
       </w:r>
     </w:p>
     <w:p>
@@ -1692,7 +1692,7 @@
     </w:p>
     <w:p>
       <w:r>
-        <w:t>— Já apontei culpados antes com menos do que isso — disse —, e errei, e tive de continuar morando na mesma rua depois.</w:t>
+        <w:t>— Já apontei culpados antes com menos do que isso — falei —, e errei, e tive de continuar morando na mesma rua depois.</w:t>
       </w:r>
     </w:p>
     <w:p>
@@ -1856,7 +1856,7 @@
     <w:p/>
     <w:p>
       <w:r>
-        <w:t>— Eu não estava procurando por isso — disse ele, soltando a última tachinha e levantando a placa de fundo. — A gente está organizando os registros de impostos, as atas da igreja e as escrituras, os ossos secos de uma cidade. Sem procurar nada além de ordem. E então… — Ele virou o desenho para a lâmpada. — E então você vira uma coisa.</w:t>
+        <w:t>— Eu não estava procurando por isso — disse ele, soltando a última tachinha e levantando a placa de fundo. — A gente está organizando os registros de impostos, as atas da igreja e as escrituras, os ossos secos de uma cidade. Sem procurar nada além de ordem. E então… — Ele virou o desenho para a lâmpada. — E então você vira uma coisa ao contrário.</w:t>
       </w:r>
     </w:p>
     <w:p/>
@@ -2197,7 +2197,7 @@
     <w:p/>
     <w:p>
       <w:r>
-        <w:t>— Vou contar uma coisa à senhora — disse ele, num tom mais baixo agora, a mágoa tendo sumido de sua voz —, e a senhora faz dela o que bem entender, porque eu mesmo não consigo entender muita coisa. Nessas manhãs em que estou no pátio no escuro, eu não tenho sido o único lá embaixo. — Ele virou a cabeça em direção à janela da frente e às fachadas das lojas da Evergreen do outro lado da praça, com o pátio fora de vista lá atrás. — Tem tido alguém rondando os fundos da loja dela. Cedo, antes de clarear o suficiente para ver um rosto, só um vulto, e que some rápido quando os faróis do meu caminhão dobram a esquina. Já vi isso duas vezes. Talvez três. Alguém onde ninguém deveria estar àquela hora, colado bem na porta dos fundos dela, e depois desaparecendo. — Ele franziu a testa, olhando fixamente para as próprias mãos. — Na primeira vez, achei que fosse um vagabundo, alguém atrás do calor que sai das saídas de ar dela. Mas um vagabundo se instala, e esse aí não. Esse aí estava fazendo alguma coisa. E sumiu assim que foi visto. Numa dessas manhãs, havia uma van que eu não conhecia, estacionada lá no fundo, perto da farmácia, com os faróis apagados. Não era a do entregador de carne. Placa de fora da cidade; não consegui anotar.</w:t>
+        <w:t>— Vou contar uma coisa à senhora — disse ele, num tom mais baixo agora, a mágoa tendo sumido de sua voz —, e a senhora faz dela o que bem entender, porque eu mesmo não consigo entender muita coisa. Nessas manhãs em que estou no pátio no escuro, eu não tenho sido o único lá embaixo. — Ele virou a cabeça em direção à janela da frente e às fachadas das lojas da Evergreen do outro lado da praça, com o pátio fora de vista lá atrás. — Tem tido alguém rondando os fundos da loja dela. Cedo, antes de clarear o suficiente para ver um rosto, só um vulto, e que some rápido quando os meus faróis dobram a esquina. Já vi isso duas vezes. Talvez três. Alguém onde ninguém deveria estar àquela hora, colado bem na porta dos fundos dela, e depois desaparecendo. — Ele franziu a testa, olhando fixamente para as próprias mãos. — Na primeira vez, achei que fosse um vagabundo, alguém atrás do calor que sai das saídas de ar dela. Mas um vagabundo se instala, e aquele vulto não. Aquele vulto estava fazendo alguma coisa. E sumiu assim que foi visto. Numa dessas manhãs, havia uma van que eu não conhecia, estacionada lá no fundo, perto da farmácia, com os faróis apagados. Não era a do entregador de carne. Placa de fora da cidade; não consegui anotar.</w:t>
       </w:r>
     </w:p>
     <w:p/>
@@ -2657,7 +2657,7 @@
     </w:p>
     <w:p>
       <w:r>
-        <w:t>— Rachadura no rejunte na base da parede do fundo. Precisa de vedação. Fresta sob a porta dos fundos com a guarnição gasta. Ao pé da letra, isso pode atrair parasitas. — Ele abriu a torneira da pia de lavar as mãos e colocou o termômetro embaixo da água. — E esta água está dois graus abaixo do exigido. Manhã fria, cano frio, eu sei. Mas esse é o número.</w:t>
+        <w:t>— Rachadura no rejunte na base da parede do fundo. Precisa de vedação. Fresta sob a porta dos fundos com a guarnição gasta. Ao pé da letra, isso pode dar passagem a pragas. — Ele abriu a torneira da pia de lavar as mãos e colocou o termômetro embaixo da água. — E esta água está dois graus abaixo do exigido. Manhã fria, cano frio, eu sei. Mas esse é o número.</w:t>
       </w:r>
     </w:p>
     <w:p>
@@ -2865,7 +2865,7 @@
     </w:p>
     <w:p>
       <w:r>
-        <w:t>— Eu ouvi. — Hal nunca na vida fingira o contrário sobre coisa alguma. — Marc Doucette foi demitido na fábrica em setembro. A fábrica de tornearia lá em Miller's Creek, pernas de cadeira e cavilhas. O turno inteiro foi, sem segredo e sem vergonha nisso. Mas a cidade está com uma janela quebrada na cabeça e uma família atrasada com o aquecimento, no mesmo mês. Juntou as duas coisas, porque duas coisas são mais fáceis de aceitar do que a verdade. Não há nada que eu possa dizer sobre isso. Quanto mais eu os defendo, mais pareço ter um motivo pelo qual precisam de defesa.</w:t>
+        <w:t>— Eu ouvi. — Hal nunca na vida fingira o contrário sobre coisa alguma. — Marc Doucette foi demitido na fábrica em setembro. A fábrica de tornearia lá em Miller's Creek, pernas de cadeira e cavilhas. O turno inteiro foi, sem segredo e sem vergonha nisso. Mas a cidade está com uma janela quebrada na cabeça e uma família atrasada com o aquecimento, no mesmo mês. Juntou as duas coisas, porque duas coisas são mais fáceis de aceitar do que a verdade. Não há nada que eu possa dizer sobre isso. Quanto mais eu os defendo, mais parece que eu sei de algum motivo pelo qual precisam ser defendidos.</w:t>
       </w:r>
     </w:p>
     <w:p>
@@ -2925,7 +2925,7 @@
     </w:p>
     <w:p>
       <w:r>
-        <w:t>Ela não quis aceitar a caixa até me servir chá. Uma mulher contando seu último metro de lenha pôs a chaleira no fogo para uma estranha antes de se deixar ajudar. Anne Doucette não seria apenas pobre na frente da senhora Claus, não se isso lhe custasse o último bocado do bom chá para evitar.</w:t>
+        <w:t>Ela não quis aceitar a caixa até me servir chá. Uma mulher contando seu último metro de lenha pôs a chaleira no fogo para uma estranha antes de se deixar ajudar. Anne Doucette não seria apenas pobre na frente da senhora Claus, nem que isso lhe custasse o último bocado do bom chá.</w:t>
       </w:r>
     </w:p>
     <w:p>
@@ -3553,7 +3553,7 @@
     </w:p>
     <w:p>
       <w:r>
-        <w:t xml:space="preserve">— Um adulto. Nada de moleque, não importa o que a cidade queira empurrar para cima de algum garotinho com uma lata de tinta. Mais alto que a Greta, e se movendo com um propósito. Sem enrolação. Sem esquentar as mãos. Ele sabia por que estava ali. E coberto. Um casaco comprido, ou um avental, solto, daqueles que a gente veste para trabalhar para não se sujar, pálido, eu diria quase, embora a escuridão tenha roubado a cor dele. Bem colado na parede dela, onde fica a entrega e aonde ninguém vai com intenção honesta. E quando os faróis do meu carro viraram, ele sumiu, rápido e silencioso, não foi uma fuga atropelada, foi uma retirada. Sem pressa nenhuma. Feito e acabado.</w:t>
+        <w:t xml:space="preserve">— Uma pessoa adulta. Nada de moleque, não importa o que a cidade queira empurrar para cima de algum garotinho com uma lata de tinta. Mais alta que a Greta, e se movendo com um propósito. Sem enrolação. Sem esquentar as mãos. Sabia por que estava ali. E coberta. Um casaco comprido, ou um avental, solto, daqueles que a gente veste para trabalhar para não se sujar, pálido, eu diria quase, embora a escuridão tenha roubado a cor dele. Bem colada na parede dela, onde fica a entrega e aonde ninguém vai com intenção honesta. E quando os meus faróis viraram, sumiu, rápido e silencioso, não foi uma fuga atropelada, foi uma retirada. Sem pressa nenhuma. Feito e acabado.</w:t>
       </w:r>
     </w:p>
     <w:p>
@@ -3588,7 +3588,7 @@
     </w:p>
     <w:p>
       <w:r>
-        <w:t>— Espantei ele duas vezes, é, quando o peguei de perto — disse ele rispidamente, meio envergonhado, um homem pego no flagra fazendo uma caridade. — Não porque eu a ame, acredite. A gente não se fala, e não vai falar até eu engolir um sapo que ainda não digeri. Mas alguém rondando a porta dela no escuro está tramando coisa suja, haja rixa ou não, e eu não vou ficar parado num pátio olhando para isso sem fazer nada.</w:t>
+        <w:t>— Espantei duas vezes, é, quando peguei o vulto de perto — disse ele rispidamente, meio envergonhado, um homem pego no flagra fazendo uma caridade. — Não porque eu a ame, acredite. A gente não se fala, e não vai falar até eu engolir um sapo que ainda não digeri. Mas alguém rondando a porta dela no escuro está tramando coisa suja, haja rixa ou não, e eu não vou ficar parado num pátio olhando para isso sem fazer nada.</w:t>
       </w:r>
     </w:p>
     <w:p>
@@ -3872,7 +3872,7 @@
     <w:p/>
     <w:p>
       <w:r>
-        <w:t>— Tive o Danny Ott na quarta série — disse Martha. — Ele era a criança que ficava no recreio para arrumar os livros da biblioteca de volta no lugar. Ninguém lhe pediu.</w:t>
+        <w:t>— Tive o Danny Ott na quarta série — disse Martha. — Ele era a criança que ficava na sala durante o recreio para arrumar os livros da biblioteca de volta no lugar. Ninguém lhe pediu.</w:t>
       </w:r>
     </w:p>
     <w:p/>
@@ -3926,7 +3926,7 @@
     <w:p/>
     <w:p>
       <w:r>
-        <w:t>— Fui à Sugarplum no meu horário de almoço — disse Ivy, com o ar de uma mulher confessando. — Não olhe para mim desse jeito. Ela abriu as portas esta manhã, e metade da avenida estava lá dentro ao meio-dia. Ela está chamando de Semana da Grande Inauguração, o que pelo que pude perceber significa sem laço e preços cheios. Quatro e cinquenta por um bolinho de amêndoa do tamanho do meu polegar.</w:t>
+        <w:t>— Fui à Sugarplum no meu horário de almoço — disse Ivy, com o ar de uma mulher confessando. — Não olhe para mim desse jeito. Ela abriu as portas esta manhã, e metade da avenida estava lá dentro ao meio-dia. Ela está chamando de Semana da Grande Inauguração, o que pelo que pude perceber significa sem corte de fita e preços cheios. Quatro e cinquenta por um bolinho de amêndoa do tamanho do meu polegar.</w:t>
       </w:r>
     </w:p>
     <w:p/>
@@ -3953,7 +3953,7 @@
     <w:p/>
     <w:p>
       <w:r>
-        <w:t>Dot não tirou os olhos do seu ponto sanfonado. — É bom que sejam bons, na loja de ouro. Alguém está pagando por todo aquele ouro nas vitrines.</w:t>
+        <w:t>Dot não tirou os olhos do seu ponto sanfonado. — É bom que sejam bons, na loja dourada. Alguém está pagando por todo aquele ouro nas vitrines.</w:t>
       </w:r>
     </w:p>
     <w:p/>
@@ -4184,7 +4184,7 @@
         <w:t>Uma semana. Talvez mais, se as peças da pia não chegarem.</w:t>
       </w:r>
       <w:r>
-        <w:t xml:space="preserve"> A semana em que a licença de Greta foi suspensa aguardando correção, quando a Holly Jolly ficaria escura e toda a sua primeira investida na temporada seria cortada limpa por baixo dela. A única semana em toda a corrida brilhante para o Natal em que a padaria mais antiga da Avenida Evergreen ficaria escura.</w:t>
+        <w:t xml:space="preserve"> A semana em que o alvará de Greta foi suspenso aguardando correção, quando a Holly Jolly ficaria escura e toda a sua primeira investida na temporada seria cortada limpa por baixo dela. A única semana em toda a corrida brilhante para o Natal em que a padaria mais antiga da Avenida Evergreen ficaria escura.</w:t>
       </w:r>
     </w:p>
     <w:p>
@@ -4403,7 +4403,7 @@
     </w:p>
     <w:p>
       <w:r>
-        <w:t>— A senhora não viu um dezembro nesta rua como o que está chegando — disse ela, à vontade, colocando a xícara diante de mim. — Eu fiz as contas. A população, os jantares da igreja, a escola, todo o calendário de festas que vocês mantêm. Há mais comércio de doces nesta cidade no Natal do que ela jamais teve em qualquer lugar para gastar, porque sempre teve apenas a velha padaria para gastar. A preços caipiras. Com produtos caipiras. — Ela disse "a velha padaria" de forma agradável, nomeando algo já passado. — Todo esse comércio está procurando para onde ir. E aqui estou eu.</w:t>
+        <w:t>— A senhora não viu um dezembro nesta rua como o que está chegando — disse ela, à vontade, colocando a xícara diante de mim. — Eu fiz as contas. A população, os jantares da igreja, a escola, todo o calendário de festas que vocês mantêm. Há mais comércio de doces nesta cidade no Natal do que ela jamais teve em qualquer lugar para gastar, porque sempre teve apenas a velha padaria onde gastar. A preços caipiras. Com produtos caipiras. — Ela disse "a velha padaria" de forma agradável, nomeando algo já passado. — Todo esse comércio está procurando para onde ir. E aqui estou eu.</w:t>
       </w:r>
     </w:p>
     <w:p>
@@ -4453,7 +4453,7 @@
     </w:p>
     <w:p>
       <w:r>
-        <w:t>— É o meu ramo. — Ela disse isso sem pestanejar. — A gente sabe por quais acusações uma cozinha comercial é autuada, da mesma forma que saberia as peças do carro. As temperaturas, as vedações, a água. É a metade chata do trabalho, e a metade que te fecha se você a negligenciar. — Ela sorriu, graciosa e impenetrável, sem uma fenda sequer onde eu pudesse enfiar uma unha. — Já passei por vistorias em três cidades. A gente aprende o código de cor. Ou não sobrevive. Tomara que ela se endireite. É um negócio difícil, ser derrotada pelos próprios canos.</w:t>
+        <w:t>— É o meu ramo. — Ela disse isso sem pestanejar. — A gente sabe por quais infrações uma cozinha comercial é autuada, da mesma forma que saberia as peças do carro. As temperaturas, as vedações, a água. É a metade chata do trabalho, e a metade que te fecha se você a negligenciar. — Ela sorriu, graciosa e impenetrável, sem uma fenda sequer onde eu pudesse enfiar uma unha. — Já passei por vistorias em três cidades. A gente aprende o código de cor. Ou não sobrevive. Tomara que ela se endireite. É um negócio difícil, ser derrotada pelos próprios canos.</w:t>
       </w:r>
     </w:p>
     <w:p>
@@ -4533,7 +4533,7 @@
     <w:p/>
     <w:p>
       <w:r>
-        <w:t xml:space="preserve">— Elas pararam — disse ele, antes que eu pudesse perguntar. — As olhadas. O que a senhora disse à sra. Bennett se espalhou. Uma senhora lá da escola disse à minha mãe com todas as letras que não podia ter sido eu. — Ele olhou para as balas de mel em vez de para mim. — Então… obrigado. Eu sei que foi a senhora.</w:t>
+        <w:t xml:space="preserve">— Elas pararam — disse ele, antes que eu pudesse perguntar. — As olhadas. O que a senhora disse à Sra. Bennett se espalhou. Uma senhora lá da escola disse à minha mãe com todas as letras que não podia ter sido eu. — Ele olhou para as balas de mel em vez de para mim. — Então… obrigado. Eu sei que foi a senhora.</w:t>
       </w:r>
     </w:p>
     <w:p/>
@@ -4593,7 +4593,7 @@
     <w:p/>
     <w:p>
       <w:r>
-        <w:t>— Teve uma manhã em que vi alguém nos fundos da Greta. Bem escuro, antes de os fornos dela acenderem, sem nenhuma luz na janela ainda. Um adulto, com avental de padeiro. Não era a Greta. A Greta é forte e troncuda, e essa pessoa era magra. Rápida e ágil, nada parecida com alguém começando o turno. Um avental comprido, daqueles que vão até a canela, claro, com um casaco por baixo. A figura ficou parada no degrau dos fundos dela um minuto e depois subiu o beco em direção ao outro extremo. Não entrou em lugar nenhum. Perdi-a de vista depois da luz da farmácia. — Ele franziu a testa. — Pensei que fosse uma entrega.</w:t>
+        <w:t>— Teve uma manhã em que vi alguém nos fundos da Greta. Bem escuro, antes de os fornos dela acenderem, sem nenhuma luz na janela ainda. Uma pessoa adulta, com avental de padeiro. Não era a Greta. A Greta é forte e troncuda, e essa pessoa era magra. Rápida e ágil, nada parecida com alguém começando o turno. Um avental comprido, daqueles que vão até a canela, claro, com um casaco por baixo. A figura ficou parada no degrau dos fundos dela um minuto e depois subiu o beco em direção ao outro extremo. Não entrou em lugar nenhum. Perdi-a de vista depois da luz da farmácia. — Ele franziu a testa. — Pensei que fosse uma entrega.</w:t>
       </w:r>
     </w:p>
     <w:p/>
@@ -4653,7 +4653,7 @@
     <w:p/>
     <w:p>
       <w:r>
-        <w:t>O dr. Mitchell estava em sua bancada com um saco de aveia de fazendeiro aberto à sua frente e uma lupa na mão. Ergueu os olhos quando entrei e depois olhou para o pote de conserva que pus ao lado da aveia.</w:t>
+        <w:t>O Dr. Mitchell estava em sua bancada com um saco de aveia de fazendeiro aberto à sua frente e uma lupa na mão. Ergueu os olhos quando entrei e depois olhou para o pote de conserva que pus ao lado da aveia.</w:t>
       </w:r>
     </w:p>
     <w:p/>
@@ -4971,7 +4971,7 @@
     <w:p/>
     <w:p>
       <w:r>
-        <w:t>Eu me sentara naquele banco com o Danny Ott e pensado que as pessoas julgavam rápido demais. Eu as vira fazer o mesmo com o Pete por causa da corrente de um portão, e com os Doucette por causa de uma conta de combustível. Eu fizera o mesmo com a Renée Duval, só que de maneira silenciosa, onde ninguém pudesse me dizer que eu estava errada. O doutor poderia ter dito. Eu o levara porque tinha tanta certeza de que ele não diria.</w:t>
+        <w:t>Eu me sentara naquele banco com o Danny Ott e pensado que as pessoas julgavam rápido demais. Eu as vira fazer o mesmo com o Pete por causa da corrente de um portão, e com os Doucette por causa de uma conta de óleo. Eu fizera o mesmo com a Renée Duval, só que de maneira silenciosa, onde ninguém pudesse me dizer que eu estava errada. O doutor poderia ter dito. Eu o levara porque tinha tanta certeza de que ele não diria.</w:t>
       </w:r>
     </w:p>
     <w:p/>
@@ -5080,7 +5080,7 @@
     </w:p>
     <w:p>
       <w:r>
-        <w:t>Ele trabalhava sem pressa e sem parar. Erguia cada página como se ela ainda pudesse rasgar. E podia. Quando uma se desfez em suas mãos, uma ata da igreja virada em polpa na dobra, ele não praguejou contra ela nem a amassou. Ele colocou as duas metades macias juntas, alinhadas na dobra, para secarem o mais inteiras que pudessem, para que quem viesse depois dele pelo menos tivesse os pedaços na ordem certa. Ele não estava salvando o acervo. Não podia. Parte dele já estava perdida, e ele sabia disso melhor do que qualquer um vivo. Ele estava salvando o que dava para salvar, uma folha molhada de cada vez, de joelhos, à meia-noite, por um lugar que não era dele e, por direito, talvez nunca voltasse a ser dele.</w:t>
+        <w:t>Ele trabalhava sem pressa e sem parar. Erguia cada página como se ela ainda pudesse rasgar. E podia. Quando uma se desfez em suas mãos, uma ata da igreja virada em polpa na dobra, ele não praguejou contra ela nem a amassou. Ele colocou as duas metades macias juntas, alinhadas no rasgo, para secarem o mais inteiras que pudessem, para que quem viesse depois dele pelo menos tivesse os pedaços na ordem certa. Ele não estava salvando o acervo. Não podia. Parte dele já estava perdida, e ele sabia disso melhor do que qualquer um vivo. Ele estava salvando o que dava para salvar, uma folha molhada de cada vez, de joelhos, à meia-noite, por um lugar que não era dele e, por direito, talvez nunca voltasse a ser dele.</w:t>
       </w:r>
     </w:p>
     <w:p>
@@ -5120,7 +5120,7 @@
     </w:p>
     <w:p>
       <w:r>
-        <w:t>— Não — disse ele simplesmente. — Mas vou terminar mais delas do que se tivesse ido para casa. — Ele pousou a folha que segurava para secar, alinhada em sua dobra, e não olhou para o relógio, e não falou sobre ele, e eu entendi que nunca falaria. Nem para mim nem para ninguém.</w:t>
+        <w:t>— Não — disse ele simplesmente. — Mas vou terminar mais delas do que se tivesse ido para casa. — Ele pousou a folha que segurava para secar, alinhada no rasgo, e não olhou para o relógio, e não falou sobre ele, e eu entendi que nunca falaria. Nem para mim nem para ninguém.</w:t>
       </w:r>
     </w:p>
     <w:p>
@@ -5211,7 +5211,7 @@
     </w:p>
     <w:p>
       <w:r>
-        <w:t>— Quem jogou aquele tijolo não estava de cabeça quente. Ele atravessou as letras douradas do nome da Greta numa noite sem ninguém na rua. E a Renée me fez sentar e contou para mim os jantares da igreja desta cidade. Ela não pega o que está mais à mão.</w:t>
+        <w:t>— Quem jogou aquele tijolo não estava de cabeça quente. O tijolo atravessou as letras douradas do nome da Greta numa noite sem ninguém na rua. E a Renée me fez sentar e contou para mim os jantares da igreja desta cidade. Ela não pega o que está mais à mão.</w:t>
       </w:r>
     </w:p>
     <w:p>
@@ -5587,7 +5587,7 @@
     </w:p>
     <w:p>
       <w:r>
-        <w:t>— Ninguém chamava aquilo assim desde a época da Joyce. — Ela disse isso olhando para o livro. — É a câmara frigorífica. Sempre foi a câmara frigorífica, para Harold, para os entregadores, para todo mundo que já trabalhou para mim. Joyce chamava de cômodo frio. Ela dizia: "Vou entrar no cômodo frio, Greta, não deixe os pãezinhos queimarem", como se fosse um cômodo de casa. E a pia perto da porta dos fundos. O velho misturador Hobart ficou do lado dela por anos, até o motor pifar, então ela o chamava de pia Hobart, e o apelido pegou com ela e com mais ninguém. — A boca dela repuxou. — Quando ela foi embora, parecia que eu tinha emudecido para os dois termos. Eu não aguentava ouvi-los na minha própria voz. Eu dizia câmara frigorífica. Eu me obrigava a dizer.</w:t>
+        <w:t>— Ninguém chamava aquilo assim desde a época da Joyce. — Ela disse isso olhando para o livro. — É a câmara frigorífica. Sempre foi a câmara frigorífica, para Harold, para os entregadores, para todo mundo que já trabalhou para mim. Joyce chamava de cômodo frio. Ela dizia: "Vou entrar no cômodo frio, Greta, não deixe os pãezinhos queimarem", como se fosse um cômodo de casa. E a pia perto da porta dos fundos. O velho misturador Hobart ficou do lado dela por anos, até o motor pifar, então ela o chamava de pia Hobart, e o apelido pegou com ela e com mais ninguém. — A boca dela repuxou. — Quando ela foi embora, parei de usar os dois termos. Eu não aguentava ouvi-los na minha própria voz. Eu dizia câmara frigorífica. Eu me obrigava a dizer.</w:t>
       </w:r>
     </w:p>
     <w:p>
@@ -6089,7 +6089,7 @@
     </w:p>
     <w:p>
       <w:r>
-        <w:t>Pip acordou com o som da torneira e cruzou o chão para parar perto da minha cadeira, olhando para cima, até que eu lhe pus um pires de manjubinhas. Ela os comeu um de cada vez, com enorme cerimônia, enquanto Nick quebrava os ovos e eu dobrava a página de Claire para guardá-la no casaco.</w:t>
+        <w:t>Pip acordou com o som da torneira e cruzou o chão para parar perto da minha cadeira, olhando para cima, até que eu lhe pus um pires de manjubinhas. Ela as comeu uma de cada vez, com enorme cerimônia, enquanto Nick quebrava os ovos e eu dobrava a página de Claire para guardá-la no casaco.</w:t>
       </w:r>
     </w:p>
     <w:p>
@@ -6269,7 +6269,7 @@
     </w:p>
     <w:p>
       <w:r>
-        <w:t>— Aquela carta de advogado em agosto — disse ela. — Stillwater. Eles queriam o lote, o ponto e o nome.</w:t>
+        <w:t>— Aquela carta de advogado em agosto — disse ela. — Stillwater. Eles queriam tudo, de corpo, alma e nome.</w:t>
       </w:r>
     </w:p>
     <w:p>
@@ -6466,7 +6466,7 @@
     <w:p/>
     <w:p>
       <w:r>
-        <w:t>— O dr. Mitchell comparou o pó da farinha dela a uma base azeda. A Pelkey's entregou um saco disso à senhora em vinte e sete de outubro, após meses sem nenhum. A senhora assinou o canhoto.</w:t>
+        <w:t>— O Dr. Mitchell identificou o pó da farinha dela como uma base azeda. A Pelkey's entregou um saco disso à senhora em vinte e sete de outubro, após meses sem nenhum. A senhora assinou o canhoto.</w:t>
       </w:r>
     </w:p>
     <w:p/>
@@ -6520,7 +6520,7 @@
     <w:p/>
     <w:p>
       <w:r>
-        <w:t xml:space="preserve"> Então ela riu, e foi uma risada curta e sem calor. Não era para Tanaka nem para mim.</w:t>
+        <w:t xml:space="preserve">Então ela riu, e foi uma risada curta e sem calor. Não era para Tanaka nem para mim.</w:t>
       </w:r>
     </w:p>
     <w:p/>
@@ -6819,7 +6819,7 @@
     <w:p/>
     <w:p>
       <w:r>
-        <w:t>— Nem depois da janta. Ela voltou às seis com o advogado, do jeito que pedi, eu a registrei, e o comissário de fiança a deixou ir para casa sob promessa de comparecimento. Ela tem sessenta e cinco anos, nunca levou sequer uma multa de trânsito e não vai a lugar nenhum. — Tanaka virou uma página. — Há condições para isso. Ela deve ficar longe de Greta e longe da Holly Jolly. Se violar isso, ela volta para cá e fica. Ela deve se apresentar ao tribunal do condado na segunda semana de dezembro.</w:t>
+        <w:t>— Não ficou nem até a hora da janta. Ela voltou às seis com o advogado, do jeito que pedi, eu a registrei, e o comissário de fiança a deixou ir para casa sob promessa de comparecimento. Ela tem sessenta e cinco anos, nunca levou sequer uma multa de trânsito e não vai a lugar nenhum. — Tanaka virou uma página. — Há condições para isso. Ela deve ficar longe de Greta e longe da Holly Jolly. Se violar isso, ela volta para cá e fica. Ela deve se apresentar ao tribunal do condado na segunda semana de dezembro.</w:t>
       </w:r>
     </w:p>
     <w:p/>
@@ -6966,7 +6966,7 @@
     <w:p/>
     <w:p>
       <w:r>
-        <w:t>— A chefe passou lá ontem à noite para pegar minha declaração. — Ela colocou o pano sobre o mármore. — Dá a entender que o tijolo saiu da minha caçamba de propósito. Que alguém se deu ao trabalho de fazer com que minha loja parecesse o tipo de loja que faria uma coisa dessas. — Ela olhou para mim, firme. — Obrigada por vir me dizer. Havia mais alguma coisa?</w:t>
+        <w:t>— A chefe passou lá ontem à noite para pegar minha declaração. — Ela colocou o pano sobre o mármore. — Pelo que entendi, o tijolo saiu da minha caçamba de propósito. Que alguém se deu ao trabalho de fazer com que minha loja parecesse o tipo de loja que faria uma coisa dessas. — Ela olhou para mim, firme. — Obrigada por vir me dizer. Havia mais alguma coisa?</w:t>
       </w:r>
     </w:p>
     <w:p/>
@@ -7083,7 +7083,7 @@
     </w:p>
     <w:p>
       <w:r>
-        <w:t>Veio do mesmo jeito simples, com a pasta de couro chata debaixo do braço, o mesmo casaco do condado. Mas, à porta da Holly Jolly, exibia um ânimo que não tinha na primeira vez, o de um homem feliz por uma vez ter sido encarregado daquilo. Tanaka levara o pote e a denúncia falsa ao condado, e os funcionários de lá viram a manobra esperta que haviam feito com a papelada e a desfizeram nó por nó. A suspensão cautelar foi revogada. Ele já devia voltar naquela semana para a nova inspeção de qualquer maneira. A peça para a pia chegara naquela manhã, e Tom a instalara antes de ele chegar. As três emendas gastas na cozinha de Greta eram as mesmas que toda cozinha antiga na avenida tinha, e já não eram nada. Varney parou no batente da porta dela e disse-lhe isso, em voz alta, com a loja meio cheia de gente que tinha vindo para ouvir.</w:t>
+        <w:t>Veio do mesmo jeito simples, com a pasta de couro chata debaixo do braço, o mesmo casaco do condado. Mas, à porta da Holly Jolly, exibia um ânimo que não tinha na primeira vez, o de um homem feliz por uma vez ter sido encarregado daquilo. Tanaka levara o pote e a denúncia falsa ao condado, e os funcionários de lá viram a manobra esperta que uma mão astuta fizera com a papelada deles e a desfizeram nó por nó. A suspensão cautelar foi revogada. Ele já devia voltar naquela semana para a nova inspeção de qualquer maneira. A peça para a pia chegara naquela manhã, e Tom a instalara antes de ele chegar. As três emendas gastas na cozinha de Greta eram as mesmas que toda cozinha antiga na avenida tinha, e já não eram nada. Varney parou no batente da porta dela e disse-lhe isso, em voz alta, com a loja meio cheia de gente que tinha vindo para ouvir.</w:t>
       </w:r>
     </w:p>
     <w:p>
@@ -7113,7 +7113,7 @@
     </w:p>
     <w:p>
       <w:r>
-        <w:t>As pessoas aqui levam sopa para uma casa que teve um doente. Não havia mais nenhum doente para alimentar, então elas esvaziaram as prateleiras dela em troca. Às duas horas, a fila saía pela porta da Holly Jolly e descia meio quarteirão, batendo os pés no frio. Greta tinha todos os fornos acesos, e o vapor no vidro estava tão espesso que não dava para ler HOLLY JOLLY da rua. Os pãezinhos de cacau tinham acabado às duas e meia. Os biscoitos de gengibre tinham chegado ao fundo do pote. Ela começou uma fornada de rolinhos de canela às três, algo que não tinha o menor cabimento começar tão tarde, e vendeu cada um deles quente e sem cobertura, antes que tivessem esfriado.</w:t>
+        <w:t>As pessoas aqui levam sopa para uma casa que teve um doente. Não havia mais nenhum doente para alimentar, então, em vez disso, esvaziaram as prateleiras dela. Às duas horas, a fila saía pela porta da Holly Jolly e descia meio quarteirão, batendo os pés no frio. Greta tinha todos os fornos acesos, e o vapor no vidro estava tão espesso que não dava para ler HOLLY JOLLY da rua. Os pãezinhos de cacau tinham acabado às duas e meia. Os biscoitos de gengibre tinham chegado ao fundo do pote. Ela começou uma fornada de rolinhos de canela às três, algo que não tinha o menor cabimento começar tão tarde, e vendeu cada um deles quente e sem cobertura, antes que tivessem esfriado.</w:t>
       </w:r>
     </w:p>
     <w:p>
@@ -7218,7 +7218,7 @@
     </w:p>
     <w:p>
       <w:r>
-        <w:t>— Você não deixou que fizessem dela a minha farinha — disse ela. Foi só isso. Ela dissera o resto a Joyce sobre a mesa da chefe, e não precisava repetir para mim.</w:t>
+        <w:t>— Você não deixou que dissessem que era a minha farinha — disse ela. Foi só isso. Ela dissera o resto a Joyce sobre a mesa da chefe, e não precisava repetir para mim.</w:t>
       </w:r>
     </w:p>
     <w:p>
@@ -7524,7 +7524,7 @@
     </w:p>
     <w:p>
       <w:r>
-        <w:t>Ele colocou na caixa uma única tachinha de latão, daqueles com os quais estivera consertando o arquivo o mês inteiro.</w:t>
+        <w:t>Ele colocou na caixa uma única tachinha de latão, daquelas com as quais estivera consertando o arquivo o mês inteiro.</w:t>
       </w:r>
     </w:p>
     <w:p>
@@ -7828,7 +7828,7 @@
     <w:p/>
     <w:p>
       <w:r>
-        <w:t>As caixas repousavam lado a lado na vitrine de vidro da sala da frente, sob a luz cinzenta. A nova, a caixa de cedro com a tampa fechada e o cartão novinho em folha, guardava a lã, o bilhete, as luvas vermelhas e todo o resto. Uma moeda havia se aquecido silenciosamente entre elas, algo de que apenas Nick e eu jamais prestaríamos contas.</w:t>
+        <w:t>As caixas repousavam lado a lado na vitrine de vidro da sala da frente, sob a luz cinzenta. A nova, a caixa de cedro com a tampa fechada e o cartão novinho em folha, guardava a lã, o bilhete, as luvas vermelhas e todo o resto. Uma moeda havia se aquecido silenciosamente entre elas, algo que só Nick e eu saberíamos explicar.</w:t>
       </w:r>
     </w:p>
     <w:p/>
@@ -7930,7 +7930,7 @@
     <w:p/>
     <w:p>
       <w:r>
-        <w:t>Estava lá sob a minha palma: a magia solta e alegre de mil Natais, puxada a um palmo de distância da sua lareira. Lá fora, além da janela da oficina, a neve caía constante sobre o pátio e a alameda. Estaria caindo sobre a cidade também, cobrindo as caixas na Sociedade e os bonecos de neve na praça. Na Evergreen, Greta estaria com todos os seis fornos acesos contra a escuridão.</w:t>
+        <w:t>Estava lá sob a minha palma: a magia solta e alegre de mil Natais, puxada um palmo mais perto da sua lareira. Lá fora, além da janela da oficina, a neve caía constante sobre o pátio e a alameda. Estaria caindo sobre a cidade também, cobrindo as caixas na Sociedade e os bonecos de neve na praça. Na Evergreen, Greta estaria com todos os seis fornos acesos contra a escuridão.</w:t>
       </w:r>
     </w:p>
     <w:p/>

</xml_diff>